<commit_message>
Doc: update the spec to revision 1.1
</commit_message>
<xml_diff>
--- a/documents/Network protocol. TRM.docx
+++ b/documents/Network protocol. TRM.docx
@@ -9,6 +9,8 @@
           <w:lang w:val="en-US"/>
         </w:rPr>
       </w:pPr>
+      <w:bookmarkStart w:id="0" w:name="_GoBack"/>
+      <w:bookmarkEnd w:id="0"/>
     </w:p>
     <w:p>
       <w:pPr>
@@ -236,7 +238,7 @@
       <w:r>
         <w:fldChar w:fldCharType="separate"/>
       </w:r>
-      <w:hyperlink w:anchor="_Toc208594362" w:history="1">
+      <w:hyperlink w:anchor="_Toc240795176" w:history="1">
         <w:r>
           <w:rPr>
             <w:rStyle w:val="a9"/>
@@ -263,7 +265,7 @@
             <w:noProof/>
             <w:webHidden/>
           </w:rPr>
-          <w:instrText xml:space="preserve"> PAGEREF _Toc208594362 \h </w:instrText>
+          <w:instrText xml:space="preserve"> PAGEREF _Toc240795176 \h </w:instrText>
         </w:r>
         <w:r>
           <w:rPr>
@@ -307,7 +309,7 @@
           <w:lang w:eastAsia="ru-RU"/>
         </w:rPr>
       </w:pPr>
-      <w:hyperlink w:anchor="_Toc208594363" w:history="1">
+      <w:hyperlink w:anchor="_Toc240795177" w:history="1">
         <w:r>
           <w:rPr>
             <w:rStyle w:val="a9"/>
@@ -334,7 +336,7 @@
             <w:noProof/>
             <w:webHidden/>
           </w:rPr>
-          <w:instrText xml:space="preserve"> PAGEREF _Toc208594363 \h </w:instrText>
+          <w:instrText xml:space="preserve"> PAGEREF _Toc240795177 \h </w:instrText>
         </w:r>
         <w:r>
           <w:rPr>
@@ -378,7 +380,7 @@
           <w:lang w:eastAsia="ru-RU"/>
         </w:rPr>
       </w:pPr>
-      <w:hyperlink w:anchor="_Toc208594364" w:history="1">
+      <w:hyperlink w:anchor="_Toc240795178" w:history="1">
         <w:r>
           <w:rPr>
             <w:rStyle w:val="a9"/>
@@ -405,7 +407,7 @@
             <w:noProof/>
             <w:webHidden/>
           </w:rPr>
-          <w:instrText xml:space="preserve"> PAGEREF _Toc208594364 \h </w:instrText>
+          <w:instrText xml:space="preserve"> PAGEREF _Toc240795178 \h </w:instrText>
         </w:r>
         <w:r>
           <w:rPr>
@@ -449,7 +451,7 @@
           <w:lang w:eastAsia="ru-RU"/>
         </w:rPr>
       </w:pPr>
-      <w:hyperlink w:anchor="_Toc208594365" w:history="1">
+      <w:hyperlink w:anchor="_Toc240795179" w:history="1">
         <w:r>
           <w:rPr>
             <w:rStyle w:val="a9"/>
@@ -476,7 +478,7 @@
             <w:noProof/>
             <w:webHidden/>
           </w:rPr>
-          <w:instrText xml:space="preserve"> PAGEREF _Toc208594365 \h </w:instrText>
+          <w:instrText xml:space="preserve"> PAGEREF _Toc240795179 \h </w:instrText>
         </w:r>
         <w:r>
           <w:rPr>
@@ -520,7 +522,7 @@
           <w:lang w:eastAsia="ru-RU"/>
         </w:rPr>
       </w:pPr>
-      <w:hyperlink w:anchor="_Toc208594366" w:history="1">
+      <w:hyperlink w:anchor="_Toc240795180" w:history="1">
         <w:r>
           <w:rPr>
             <w:rStyle w:val="a9"/>
@@ -547,7 +549,7 @@
             <w:noProof/>
             <w:webHidden/>
           </w:rPr>
-          <w:instrText xml:space="preserve"> PAGEREF _Toc208594366 \h </w:instrText>
+          <w:instrText xml:space="preserve"> PAGEREF _Toc240795180 \h </w:instrText>
         </w:r>
         <w:r>
           <w:rPr>
@@ -591,7 +593,7 @@
           <w:lang w:eastAsia="ru-RU"/>
         </w:rPr>
       </w:pPr>
-      <w:hyperlink w:anchor="_Toc208594367" w:history="1">
+      <w:hyperlink w:anchor="_Toc240795181" w:history="1">
         <w:r>
           <w:rPr>
             <w:rStyle w:val="a9"/>
@@ -618,7 +620,7 @@
             <w:noProof/>
             <w:webHidden/>
           </w:rPr>
-          <w:instrText xml:space="preserve"> PAGEREF _Toc208594367 \h </w:instrText>
+          <w:instrText xml:space="preserve"> PAGEREF _Toc240795181 \h </w:instrText>
         </w:r>
         <w:r>
           <w:rPr>
@@ -662,7 +664,7 @@
           <w:lang w:eastAsia="ru-RU"/>
         </w:rPr>
       </w:pPr>
-      <w:hyperlink w:anchor="_Toc208594368" w:history="1">
+      <w:hyperlink w:anchor="_Toc240795182" w:history="1">
         <w:r>
           <w:rPr>
             <w:rStyle w:val="a9"/>
@@ -689,7 +691,7 @@
             <w:noProof/>
             <w:webHidden/>
           </w:rPr>
-          <w:instrText xml:space="preserve"> PAGEREF _Toc208594368 \h </w:instrText>
+          <w:instrText xml:space="preserve"> PAGEREF _Toc240795182 \h </w:instrText>
         </w:r>
         <w:r>
           <w:rPr>
@@ -739,12 +741,12 @@
       <w:pPr>
         <w:pStyle w:val="1"/>
       </w:pPr>
-      <w:bookmarkStart w:id="0" w:name="_Toc208594362"/>
+      <w:bookmarkStart w:id="1" w:name="_Toc240795176"/>
       <w:r>
         <w:lastRenderedPageBreak/>
         <w:t>ИСТОРИЯ РЕВИЗИЙ</w:t>
       </w:r>
-      <w:bookmarkEnd w:id="0"/>
+      <w:bookmarkEnd w:id="1"/>
     </w:p>
     <w:tbl>
       <w:tblPr>
@@ -880,6 +882,191 @@
           </w:p>
         </w:tc>
       </w:tr>
+      <w:tr>
+        <w:tc>
+          <w:tcPr>
+            <w:tcW w:w="1271" w:type="dxa"/>
+          </w:tcPr>
+          <w:p>
+            <w:pPr>
+              <w:ind w:firstLine="0"/>
+              <w:jc w:val="center"/>
+              <w:rPr>
+                <w:lang w:val="en-US"/>
+              </w:rPr>
+            </w:pPr>
+            <w:r>
+              <w:rPr>
+                <w:lang w:val="en-US"/>
+              </w:rPr>
+              <w:t>1.1</w:t>
+            </w:r>
+          </w:p>
+        </w:tc>
+        <w:tc>
+          <w:tcPr>
+            <w:tcW w:w="1559" w:type="dxa"/>
+          </w:tcPr>
+          <w:p>
+            <w:pPr>
+              <w:ind w:firstLine="0"/>
+              <w:jc w:val="center"/>
+              <w:rPr>
+                <w:lang w:val="en-US"/>
+              </w:rPr>
+            </w:pPr>
+            <w:r>
+              <w:rPr>
+                <w:lang w:val="en-US"/>
+              </w:rPr>
+              <w:t>20.09.2026</w:t>
+            </w:r>
+          </w:p>
+        </w:tc>
+        <w:tc>
+          <w:tcPr>
+            <w:tcW w:w="7364" w:type="dxa"/>
+          </w:tcPr>
+          <w:p>
+            <w:pPr>
+              <w:pStyle w:val="aa"/>
+              <w:numPr>
+                <w:ilvl w:val="0"/>
+                <w:numId w:val="23"/>
+              </w:numPr>
+              <w:ind w:left="318" w:hanging="284"/>
+            </w:pPr>
+            <w:r>
+              <w:t>Упоминания</w:t>
+            </w:r>
+            <w:r>
+              <w:t xml:space="preserve"> </w:t>
+            </w:r>
+            <w:r>
+              <w:rPr>
+                <w:lang w:val="en-US"/>
+              </w:rPr>
+              <w:t>IP</w:t>
+            </w:r>
+            <w:r>
+              <w:t xml:space="preserve"> </w:t>
+            </w:r>
+            <w:r>
+              <w:rPr>
+                <w:lang w:val="en-US"/>
+              </w:rPr>
+              <w:t>Aurora</w:t>
+            </w:r>
+            <w:r>
+              <w:t>8</w:t>
+            </w:r>
+            <w:r>
+              <w:rPr>
+                <w:lang w:val="en-US"/>
+              </w:rPr>
+              <w:t>B</w:t>
+            </w:r>
+            <w:r>
+              <w:t>10</w:t>
+            </w:r>
+            <w:r>
+              <w:rPr>
+                <w:lang w:val="en-US"/>
+              </w:rPr>
+              <w:t>B</w:t>
+            </w:r>
+            <w:r>
+              <w:t xml:space="preserve"> </w:t>
+            </w:r>
+            <w:r>
+              <w:t xml:space="preserve">заменены на </w:t>
+            </w:r>
+            <w:r>
+              <w:rPr>
+                <w:lang w:val="en-US"/>
+              </w:rPr>
+              <w:t>Aurora</w:t>
+            </w:r>
+            <w:r>
+              <w:t>64</w:t>
+            </w:r>
+            <w:r>
+              <w:rPr>
+                <w:lang w:val="en-US"/>
+              </w:rPr>
+              <w:t>b</w:t>
+            </w:r>
+            <w:r>
+              <w:t>66</w:t>
+            </w:r>
+            <w:r>
+              <w:rPr>
+                <w:lang w:val="en-US"/>
+              </w:rPr>
+              <w:t>b</w:t>
+            </w:r>
+          </w:p>
+          <w:p>
+            <w:pPr>
+              <w:pStyle w:val="aa"/>
+              <w:numPr>
+                <w:ilvl w:val="0"/>
+                <w:numId w:val="23"/>
+              </w:numPr>
+              <w:ind w:left="318" w:hanging="284"/>
+            </w:pPr>
+            <w:r>
+              <w:t xml:space="preserve">Разрядность интерфейса </w:t>
+            </w:r>
+            <w:r>
+              <w:rPr>
+                <w:lang w:val="en-US"/>
+              </w:rPr>
+              <w:t>AXI</w:t>
+            </w:r>
+            <w:r>
+              <w:t xml:space="preserve">4 </w:t>
+            </w:r>
+            <w:r>
+              <w:rPr>
+                <w:lang w:val="en-US"/>
+              </w:rPr>
+              <w:t>Stream</w:t>
+            </w:r>
+            <w:r>
+              <w:t xml:space="preserve"> </w:t>
+            </w:r>
+            <w:r>
+              <w:t>изменена с 64 на 128</w:t>
+            </w:r>
+          </w:p>
+          <w:p>
+            <w:pPr>
+              <w:pStyle w:val="aa"/>
+              <w:numPr>
+                <w:ilvl w:val="0"/>
+                <w:numId w:val="23"/>
+              </w:numPr>
+              <w:ind w:left="318" w:hanging="284"/>
+            </w:pPr>
+            <w:r>
+              <w:t xml:space="preserve">Добавлены роли </w:t>
+            </w:r>
+            <w:r>
+              <w:rPr>
+                <w:lang w:val="en-US"/>
+              </w:rPr>
+              <w:t>APB</w:t>
+            </w:r>
+            <w:r>
+              <w:t xml:space="preserve">3 </w:t>
+            </w:r>
+            <w:r>
+              <w:t>на рисунке 2</w:t>
+            </w:r>
+          </w:p>
+        </w:tc>
+      </w:tr>
     </w:tbl>
     <w:p/>
     <w:p>
@@ -896,12 +1083,12 @@
       <w:pPr>
         <w:pStyle w:val="1"/>
       </w:pPr>
-      <w:bookmarkStart w:id="1" w:name="_Toc208594363"/>
+      <w:bookmarkStart w:id="2" w:name="_Toc240795177"/>
       <w:r>
         <w:lastRenderedPageBreak/>
         <w:t>ОБЩИЕ ПОЛОЖЕНИЯ</w:t>
       </w:r>
-      <w:bookmarkEnd w:id="1"/>
+      <w:bookmarkEnd w:id="2"/>
     </w:p>
     <w:p>
       <w:r>
@@ -1044,35 +1231,40 @@
           <w:rPr>
             <w:rStyle w:val="a9"/>
           </w:rPr>
-          <w:t>8</w:t>
+          <w:t>64</w:t>
         </w:r>
         <w:r>
           <w:rPr>
             <w:rStyle w:val="a9"/>
             <w:lang w:val="en-US"/>
           </w:rPr>
-          <w:t>B</w:t>
+          <w:t>b</w:t>
         </w:r>
         <w:r>
           <w:rPr>
             <w:rStyle w:val="a9"/>
           </w:rPr>
-          <w:t>10</w:t>
+          <w:t>66</w:t>
         </w:r>
         <w:r>
           <w:rPr>
             <w:rStyle w:val="a9"/>
             <w:lang w:val="en-US"/>
           </w:rPr>
-          <w:t>B</w:t>
+          <w:t>b</w:t>
         </w:r>
       </w:hyperlink>
       <w:r>
         <w:t xml:space="preserve"> </w:t>
       </w:r>
       <w:r>
-        <w:t>от Xilinx</w:t>
-      </w:r>
+        <w:t xml:space="preserve">от </w:t>
+      </w:r>
+      <w:proofErr w:type="spellStart"/>
+      <w:r>
+        <w:t>Xilinx</w:t>
+      </w:r>
+      <w:proofErr w:type="spellEnd"/>
       <w:r>
         <w:t>.</w:t>
       </w:r>
@@ -1141,22 +1333,22 @@
         <w:t>Aurora</w:t>
       </w:r>
       <w:r>
-        <w:t>8</w:t>
+        <w:t>64</w:t>
       </w:r>
       <w:r>
         <w:rPr>
           <w:lang w:val="en-US"/>
         </w:rPr>
-        <w:t>B</w:t>
-      </w:r>
-      <w:r>
-        <w:t>10</w:t>
+        <w:t>b</w:t>
+      </w:r>
+      <w:r>
+        <w:t>66</w:t>
       </w:r>
       <w:r>
         <w:rPr>
           <w:lang w:val="en-US"/>
         </w:rPr>
-        <w:t>B</w:t>
+        <w:t>b</w:t>
       </w:r>
       <w:r>
         <w:t>.</w:t>
@@ -1342,12 +1534,7 @@
         <w:t>к</w:t>
       </w:r>
       <w:r>
-        <w:t>ой подключения узла к другому узлу, находящемуся дальше от корня де</w:t>
-      </w:r>
-      <w:bookmarkStart w:id="2" w:name="_GoBack"/>
-      <w:bookmarkEnd w:id="2"/>
-      <w:r>
-        <w:t>рева. Любой узел может иметь один или несколько нисходящих портов или не иметь их вообще. Узел не имеющий нисходящих портов является оконечным узлом.</w:t>
+        <w:t>ой подключения узла к другому узлу, находящемуся дальше от корня дерева. Любой узел может иметь один или несколько нисходящих портов или не иметь их вообще. Узел не имеющий нисходящих портов является оконечным узлом.</w:t>
       </w:r>
     </w:p>
     <w:p>
@@ -1568,10 +1755,10 @@
             <v:path o:extrusionok="f" gradientshapeok="t" o:connecttype="rect"/>
             <o:lock v:ext="edit" aspectratio="t"/>
           </v:shapetype>
-          <v:shape id="_x0000_i1027" type="#_x0000_t75" style="width:509.85pt;height:578.5pt" o:ole="">
+          <v:shape id="_x0000_i1025" type="#_x0000_t75" style="width:510.1pt;height:578.05pt" o:ole="">
             <v:imagedata r:id="rId10" o:title=""/>
           </v:shape>
-          <o:OLEObject Type="Embed" ProgID="Visio.Drawing.15" ShapeID="_x0000_i1027" DrawAspect="Content" ObjectID="_1819207357" r:id="rId11"/>
+          <o:OLEObject Type="Embed" ProgID="Visio.Drawing.15" ShapeID="_x0000_i1025" DrawAspect="Content" ObjectID="_1851408499" r:id="rId11"/>
         </w:object>
       </w:r>
     </w:p>
@@ -1602,7 +1789,7 @@
       <w:pPr>
         <w:pStyle w:val="1"/>
       </w:pPr>
-      <w:bookmarkStart w:id="3" w:name="_Toc208594364"/>
+      <w:bookmarkStart w:id="3" w:name="_Toc240795178"/>
       <w:r>
         <w:lastRenderedPageBreak/>
         <w:t>ПАКЕТЫ ИНФОРМАЦИОННОГО ОБМЕНА</w:t>
@@ -1653,7 +1840,13 @@
         <w:t xml:space="preserve"> </w:t>
       </w:r>
       <w:r>
-        <w:t xml:space="preserve">данных пакета – 64 бита, порядок следования байт – </w:t>
+        <w:t xml:space="preserve">данных пакета – </w:t>
+      </w:r>
+      <w:r>
+        <w:t>128</w:t>
+      </w:r>
+      <w:r>
+        <w:t xml:space="preserve"> бит, порядок следования байт – </w:t>
       </w:r>
       <w:r>
         <w:rPr>
@@ -1681,7 +1874,19 @@
     </w:p>
     <w:p>
       <w:r>
-        <w:t xml:space="preserve">Первое слово любого пакета информационного обмена является заголовком и имеет формат, представленный в таблице </w:t>
+        <w:t>Младшая половина п</w:t>
+      </w:r>
+      <w:r>
+        <w:t>ерво</w:t>
+      </w:r>
+      <w:r>
+        <w:t>го</w:t>
+      </w:r>
+      <w:r>
+        <w:t xml:space="preserve"> слова</w:t>
+      </w:r>
+      <w:r>
+        <w:t xml:space="preserve"> любого пакета информационного обмена является заголовком и имеет формат, представленный в таблице </w:t>
       </w:r>
       <w:r>
         <w:t>1</w:t>
@@ -2942,10 +3147,10 @@
       </w:pPr>
       <w:r>
         <w:object w:dxaOrig="14491" w:dyaOrig="11611">
-          <v:shape id="_x0000_i1041" type="#_x0000_t75" style="width:509.85pt;height:408.55pt" o:ole="">
+          <v:shape id="_x0000_i1026" type="#_x0000_t75" style="width:510.1pt;height:408.9pt" o:ole="">
             <v:imagedata r:id="rId13" o:title=""/>
           </v:shape>
-          <o:OLEObject Type="Embed" ProgID="Visio.Drawing.15" ShapeID="_x0000_i1041" DrawAspect="Content" ObjectID="_1819207358" r:id="rId14"/>
+          <o:OLEObject Type="Embed" ProgID="Visio.Drawing.15" ShapeID="_x0000_i1026" DrawAspect="Content" ObjectID="_1851408500" r:id="rId14"/>
         </w:object>
       </w:r>
     </w:p>
@@ -3033,7 +3238,7 @@
       <w:pPr>
         <w:pStyle w:val="2"/>
       </w:pPr>
-      <w:bookmarkStart w:id="4" w:name="_Toc208594365"/>
+      <w:bookmarkStart w:id="4" w:name="_Toc240795179"/>
       <w:r>
         <w:t xml:space="preserve">Пакеты </w:t>
       </w:r>
@@ -3055,11 +3260,6 @@
     </w:p>
     <w:p/>
     <w:p>
-      <w:pPr>
-        <w:rPr>
-          <w:lang w:val="en-US"/>
-        </w:rPr>
-      </w:pPr>
       <w:r>
         <w:t>Таблица</w:t>
       </w:r>
@@ -3103,7 +3303,6 @@
       <w:r>
         <w:rPr>
           <w:i/>
-          <w:lang w:val="en-US"/>
         </w:rPr>
         <w:t xml:space="preserve"> </w:t>
       </w:r>
@@ -3115,10 +3314,16 @@
         <w:t>ID</w:t>
       </w:r>
       <w:r>
+        <w:t xml:space="preserve"> = 0</w:t>
+      </w:r>
+      <w:r>
         <w:rPr>
           <w:lang w:val="en-US"/>
         </w:rPr>
-        <w:t xml:space="preserve"> = 0</w:t>
+        <w:t>x</w:t>
+      </w:r>
+      <w:r>
+        <w:t>00, 0</w:t>
       </w:r>
       <w:r>
         <w:rPr>
@@ -3127,10 +3332,16 @@
         <w:t>x</w:t>
       </w:r>
       <w:r>
+        <w:t>80, 0</w:t>
+      </w:r>
+      <w:r>
         <w:rPr>
           <w:lang w:val="en-US"/>
         </w:rPr>
-        <w:t>00, 0</w:t>
+        <w:t>x</w:t>
+      </w:r>
+      <w:r>
+        <w:t>01, 0</w:t>
       </w:r>
       <w:r>
         <w:rPr>
@@ -3139,33 +3350,6 @@
         <w:t>x</w:t>
       </w:r>
       <w:r>
-        <w:rPr>
-          <w:lang w:val="en-US"/>
-        </w:rPr>
-        <w:t>80, 0</w:t>
-      </w:r>
-      <w:r>
-        <w:rPr>
-          <w:lang w:val="en-US"/>
-        </w:rPr>
-        <w:t>x</w:t>
-      </w:r>
-      <w:r>
-        <w:rPr>
-          <w:lang w:val="en-US"/>
-        </w:rPr>
-        <w:t>01, 0</w:t>
-      </w:r>
-      <w:r>
-        <w:rPr>
-          <w:lang w:val="en-US"/>
-        </w:rPr>
-        <w:t>x</w:t>
-      </w:r>
-      <w:r>
-        <w:rPr>
-          <w:lang w:val="en-US"/>
-        </w:rPr>
         <w:t>81</w:t>
       </w:r>
     </w:p>
@@ -3994,7 +4178,10 @@
         <w:rPr>
           <w:lang w:val="en-US"/>
         </w:rPr>
-        <w:t xml:space="preserve">Control </w:t>
+        <w:t>Control</w:t>
+      </w:r>
+      <w:r>
+        <w:t xml:space="preserve"> </w:t>
       </w:r>
       <w:r>
         <w:t>представлен в таблице 4.</w:t>
@@ -5130,7 +5317,7 @@
       <w:pPr>
         <w:pStyle w:val="2"/>
       </w:pPr>
-      <w:bookmarkStart w:id="5" w:name="_Toc208594366"/>
+      <w:bookmarkStart w:id="5" w:name="_Toc240795180"/>
       <w:r>
         <w:t xml:space="preserve">Пакеты </w:t>
       </w:r>
@@ -5150,12 +5337,34 @@
         <w:t>. Настоящий документ не накладывает ограничений на длину пакета данных.</w:t>
       </w:r>
       <w:r>
-        <w:t xml:space="preserve"> Допускается передача пакетов данных длиной в одно 64-х разрядное слово, т.е. пакетов, состоящих только из заголовка.</w:t>
+        <w:t xml:space="preserve"> Допускается передача пакетов данных длиной в одно </w:t>
+      </w:r>
+      <w:r>
+        <w:t xml:space="preserve">неполное </w:t>
+      </w:r>
+      <w:r>
+        <w:t>128</w:t>
+      </w:r>
+      <w:r>
+        <w:t>-</w:t>
+      </w:r>
+      <w:r>
+        <w:t>ми</w:t>
+      </w:r>
+      <w:r>
+        <w:t xml:space="preserve"> разрядное слово, </w:t>
+      </w:r>
+      <w:r>
+        <w:t>содержащее только заголовок</w:t>
+      </w:r>
+      <w:r>
+        <w:t>.</w:t>
       </w:r>
     </w:p>
     <w:p/>
     <w:p>
       <w:r>
+        <w:lastRenderedPageBreak/>
         <w:t>Таблица</w:t>
       </w:r>
       <w:r>
@@ -5663,7 +5872,7 @@
       <w:pPr>
         <w:pStyle w:val="1"/>
       </w:pPr>
-      <w:bookmarkStart w:id="6" w:name="_Toc208594367"/>
+      <w:bookmarkStart w:id="6" w:name="_Toc240795181"/>
       <w:r>
         <w:lastRenderedPageBreak/>
         <w:t xml:space="preserve">АДРЕСАЦИЯ УЗЛОВ </w:t>
@@ -5924,7 +6133,7 @@
       <w:pPr>
         <w:pStyle w:val="1"/>
       </w:pPr>
-      <w:bookmarkStart w:id="7" w:name="_Toc208594368"/>
+      <w:bookmarkStart w:id="7" w:name="_Toc240795182"/>
       <w:r>
         <w:lastRenderedPageBreak/>
         <w:t>КОНФИГУРАЦИОННОЕ АДРЕСНОЕ ПРОСТРАНСТВО</w:t>
@@ -6502,9 +6711,6 @@
             <w:pPr>
               <w:ind w:firstLine="0"/>
               <w:jc w:val="center"/>
-              <w:rPr>
-                <w:lang w:val="en-US"/>
-              </w:rPr>
             </w:pPr>
           </w:p>
         </w:tc>
@@ -6540,9 +6746,6 @@
             <w:pPr>
               <w:ind w:firstLine="0"/>
               <w:jc w:val="center"/>
-              <w:rPr>
-                <w:lang w:val="en-US"/>
-              </w:rPr>
             </w:pPr>
           </w:p>
         </w:tc>
@@ -7117,6 +7320,7 @@
               <w:jc w:val="center"/>
             </w:pPr>
             <w:r>
+              <w:lastRenderedPageBreak/>
               <w:t>0</w:t>
             </w:r>
             <w:r>
@@ -7524,22 +7728,22 @@
               <w:t>Aurora</w:t>
             </w:r>
             <w:r>
-              <w:t>8</w:t>
-            </w:r>
-            <w:r>
-              <w:rPr>
-                <w:lang w:val="en-US"/>
-              </w:rPr>
-              <w:t>B</w:t>
-            </w:r>
-            <w:r>
-              <w:t>10</w:t>
-            </w:r>
-            <w:r>
-              <w:rPr>
-                <w:lang w:val="en-US"/>
-              </w:rPr>
-              <w:t>B</w:t>
+              <w:t>64</w:t>
+            </w:r>
+            <w:r>
+              <w:rPr>
+                <w:lang w:val="en-US"/>
+              </w:rPr>
+              <w:t>b</w:t>
+            </w:r>
+            <w:r>
+              <w:t>66</w:t>
+            </w:r>
+            <w:r>
+              <w:rPr>
+                <w:lang w:val="en-US"/>
+              </w:rPr>
+              <w:t>b</w:t>
             </w:r>
             <w:r>
               <w:t xml:space="preserve"> </w:t>
@@ -7664,22 +7868,22 @@
               <w:t>Aurora</w:t>
             </w:r>
             <w:r>
-              <w:t>8</w:t>
-            </w:r>
-            <w:r>
-              <w:rPr>
-                <w:lang w:val="en-US"/>
-              </w:rPr>
-              <w:t>B</w:t>
-            </w:r>
-            <w:r>
-              <w:t>10</w:t>
-            </w:r>
-            <w:r>
-              <w:rPr>
-                <w:lang w:val="en-US"/>
-              </w:rPr>
-              <w:t>B</w:t>
+              <w:t>64</w:t>
+            </w:r>
+            <w:r>
+              <w:rPr>
+                <w:lang w:val="en-US"/>
+              </w:rPr>
+              <w:t>b</w:t>
+            </w:r>
+            <w:r>
+              <w:t>66</w:t>
+            </w:r>
+            <w:r>
+              <w:rPr>
+                <w:lang w:val="en-US"/>
+              </w:rPr>
+              <w:t>b</w:t>
             </w:r>
             <w:r>
               <w:t xml:space="preserve"> </w:t>
@@ -8104,13 +8308,7 @@
               <w:rPr>
                 <w:b/>
               </w:rPr>
-              <w:t>выключение</w:t>
-            </w:r>
-            <w:r>
-              <w:rPr>
-                <w:b/>
-              </w:rPr>
-              <w:t xml:space="preserve"> нисходящих портов</w:t>
+              <w:t>выключение нисходящих портов</w:t>
             </w:r>
           </w:p>
         </w:tc>
@@ -8194,6 +8392,7 @@
               <w:jc w:val="left"/>
             </w:pPr>
             <w:r>
+              <w:lastRenderedPageBreak/>
               <w:t>0 – порт выключен;</w:t>
             </w:r>
           </w:p>
@@ -8274,6 +8473,7 @@
               <w:jc w:val="center"/>
             </w:pPr>
             <w:r>
+              <w:lastRenderedPageBreak/>
               <w:t>0</w:t>
             </w:r>
             <w:r>
@@ -8541,13 +8741,7 @@
               <w:rPr>
                 <w:b/>
               </w:rPr>
-              <w:t xml:space="preserve">Диагностика нисходящих портов. </w:t>
-            </w:r>
-            <w:r>
-              <w:rPr>
-                <w:b/>
-              </w:rPr>
-              <w:t>Счетчики соединений</w:t>
+              <w:t>Диагностика нисходящих портов. Счетчики соединений</w:t>
             </w:r>
           </w:p>
         </w:tc>
@@ -8636,22 +8830,22 @@
               <w:t>Aurora</w:t>
             </w:r>
             <w:r>
-              <w:t>8</w:t>
-            </w:r>
-            <w:r>
-              <w:rPr>
-                <w:lang w:val="en-US"/>
-              </w:rPr>
-              <w:t>B</w:t>
-            </w:r>
-            <w:r>
-              <w:t>10</w:t>
-            </w:r>
-            <w:r>
-              <w:rPr>
-                <w:lang w:val="en-US"/>
-              </w:rPr>
-              <w:t>B</w:t>
+              <w:t>64</w:t>
+            </w:r>
+            <w:r>
+              <w:rPr>
+                <w:lang w:val="en-US"/>
+              </w:rPr>
+              <w:t>b</w:t>
+            </w:r>
+            <w:r>
+              <w:t>66</w:t>
+            </w:r>
+            <w:r>
+              <w:rPr>
+                <w:lang w:val="en-US"/>
+              </w:rPr>
+              <w:t>b</w:t>
             </w:r>
             <w:r>
               <w:t xml:space="preserve"> </w:t>
@@ -8997,13 +9191,7 @@
               <w:rPr>
                 <w:b/>
               </w:rPr>
-              <w:t xml:space="preserve">. </w:t>
-            </w:r>
-            <w:r>
-              <w:rPr>
-                <w:b/>
-              </w:rPr>
-              <w:t>Счетчики ошибок</w:t>
+              <w:t>. Счетчики ошибок</w:t>
             </w:r>
           </w:p>
         </w:tc>
@@ -9092,22 +9280,22 @@
               <w:t>Aurora</w:t>
             </w:r>
             <w:r>
-              <w:t>8</w:t>
-            </w:r>
-            <w:r>
-              <w:rPr>
-                <w:lang w:val="en-US"/>
-              </w:rPr>
-              <w:t>B</w:t>
-            </w:r>
-            <w:r>
-              <w:t>10</w:t>
-            </w:r>
-            <w:r>
-              <w:rPr>
-                <w:lang w:val="en-US"/>
-              </w:rPr>
-              <w:t>B</w:t>
+              <w:t>64</w:t>
+            </w:r>
+            <w:r>
+              <w:rPr>
+                <w:lang w:val="en-US"/>
+              </w:rPr>
+              <w:t>b</w:t>
+            </w:r>
+            <w:r>
+              <w:t>66</w:t>
+            </w:r>
+            <w:r>
+              <w:rPr>
+                <w:lang w:val="en-US"/>
+              </w:rPr>
+              <w:t>b</w:t>
             </w:r>
             <w:r>
               <w:t xml:space="preserve"> </w:t>
@@ -9304,6 +9492,7 @@
               <w:jc w:val="center"/>
             </w:pPr>
             <w:r>
+              <w:lastRenderedPageBreak/>
               <w:t>0</w:t>
             </w:r>
             <w:r>
@@ -9451,6 +9640,7 @@
             <w:rPr>
               <w:sz w:val="20"/>
               <w:szCs w:val="20"/>
+              <w:lang w:val="en-US"/>
             </w:rPr>
           </w:pPr>
           <w:r>
@@ -9471,8 +9661,9 @@
             <w:rPr>
               <w:sz w:val="20"/>
               <w:szCs w:val="20"/>
+              <w:lang w:val="en-US"/>
             </w:rPr>
-            <w:t>0</w:t>
+            <w:t>1</w:t>
           </w:r>
         </w:p>
       </w:tc>
@@ -9662,6 +9853,119 @@
 <file path=word/numbering.xml><?xml version="1.0" encoding="utf-8"?>
 <w:numbering xmlns:wpc="http://schemas.microsoft.com/office/word/2010/wordprocessingCanvas" xmlns:mc="http://schemas.openxmlformats.org/markup-compatibility/2006" xmlns:o="urn:schemas-microsoft-com:office:office" xmlns:r="http://schemas.openxmlformats.org/officeDocument/2006/relationships" xmlns:m="http://schemas.openxmlformats.org/officeDocument/2006/math" xmlns:v="urn:schemas-microsoft-com:vml" xmlns:wp14="http://schemas.microsoft.com/office/word/2010/wordprocessingDrawing" xmlns:wp="http://schemas.openxmlformats.org/drawingml/2006/wordprocessingDrawing" xmlns:w10="urn:schemas-microsoft-com:office:word" xmlns:w="http://schemas.openxmlformats.org/wordprocessingml/2006/main" xmlns:w14="http://schemas.microsoft.com/office/word/2010/wordml" xmlns:w15="http://schemas.microsoft.com/office/word/2012/wordml" xmlns:wpg="http://schemas.microsoft.com/office/word/2010/wordprocessingGroup" xmlns:wpi="http://schemas.microsoft.com/office/word/2010/wordprocessingInk" xmlns:wne="http://schemas.microsoft.com/office/word/2006/wordml" xmlns:wps="http://schemas.microsoft.com/office/word/2010/wordprocessingShape" mc:Ignorable="w14 w15 wp14">
   <w:abstractNum w:abstractNumId="0" w15:restartNumberingAfterBreak="0">
+    <w:nsid w:val="0356299D"/>
+    <w:multiLevelType w:val="hybridMultilevel"/>
+    <w:tmpl w:val="6A4C6B52"/>
+    <w:lvl w:ilvl="0" w:tplc="639016EA">
+      <w:start w:val="1"/>
+      <w:numFmt w:val="bullet"/>
+      <w:lvlText w:val="−"/>
+      <w:lvlJc w:val="left"/>
+      <w:pPr>
+        <w:ind w:left="720" w:hanging="360"/>
+      </w:pPr>
+      <w:rPr>
+        <w:rFonts w:ascii="Times New Roman" w:hAnsi="Times New Roman" w:cs="Times New Roman" w:hint="default"/>
+      </w:rPr>
+    </w:lvl>
+    <w:lvl w:ilvl="1" w:tplc="04190003" w:tentative="1">
+      <w:start w:val="1"/>
+      <w:numFmt w:val="bullet"/>
+      <w:lvlText w:val="o"/>
+      <w:lvlJc w:val="left"/>
+      <w:pPr>
+        <w:ind w:left="1440" w:hanging="360"/>
+      </w:pPr>
+      <w:rPr>
+        <w:rFonts w:ascii="Courier New" w:hAnsi="Courier New" w:cs="Courier New" w:hint="default"/>
+      </w:rPr>
+    </w:lvl>
+    <w:lvl w:ilvl="2" w:tplc="04190005" w:tentative="1">
+      <w:start w:val="1"/>
+      <w:numFmt w:val="bullet"/>
+      <w:lvlText w:val=""/>
+      <w:lvlJc w:val="left"/>
+      <w:pPr>
+        <w:ind w:left="2160" w:hanging="360"/>
+      </w:pPr>
+      <w:rPr>
+        <w:rFonts w:ascii="Wingdings" w:hAnsi="Wingdings" w:hint="default"/>
+      </w:rPr>
+    </w:lvl>
+    <w:lvl w:ilvl="3" w:tplc="04190001" w:tentative="1">
+      <w:start w:val="1"/>
+      <w:numFmt w:val="bullet"/>
+      <w:lvlText w:val=""/>
+      <w:lvlJc w:val="left"/>
+      <w:pPr>
+        <w:ind w:left="2880" w:hanging="360"/>
+      </w:pPr>
+      <w:rPr>
+        <w:rFonts w:ascii="Symbol" w:hAnsi="Symbol" w:hint="default"/>
+      </w:rPr>
+    </w:lvl>
+    <w:lvl w:ilvl="4" w:tplc="04190003" w:tentative="1">
+      <w:start w:val="1"/>
+      <w:numFmt w:val="bullet"/>
+      <w:lvlText w:val="o"/>
+      <w:lvlJc w:val="left"/>
+      <w:pPr>
+        <w:ind w:left="3600" w:hanging="360"/>
+      </w:pPr>
+      <w:rPr>
+        <w:rFonts w:ascii="Courier New" w:hAnsi="Courier New" w:cs="Courier New" w:hint="default"/>
+      </w:rPr>
+    </w:lvl>
+    <w:lvl w:ilvl="5" w:tplc="04190005" w:tentative="1">
+      <w:start w:val="1"/>
+      <w:numFmt w:val="bullet"/>
+      <w:lvlText w:val=""/>
+      <w:lvlJc w:val="left"/>
+      <w:pPr>
+        <w:ind w:left="4320" w:hanging="360"/>
+      </w:pPr>
+      <w:rPr>
+        <w:rFonts w:ascii="Wingdings" w:hAnsi="Wingdings" w:hint="default"/>
+      </w:rPr>
+    </w:lvl>
+    <w:lvl w:ilvl="6" w:tplc="04190001" w:tentative="1">
+      <w:start w:val="1"/>
+      <w:numFmt w:val="bullet"/>
+      <w:lvlText w:val=""/>
+      <w:lvlJc w:val="left"/>
+      <w:pPr>
+        <w:ind w:left="5040" w:hanging="360"/>
+      </w:pPr>
+      <w:rPr>
+        <w:rFonts w:ascii="Symbol" w:hAnsi="Symbol" w:hint="default"/>
+      </w:rPr>
+    </w:lvl>
+    <w:lvl w:ilvl="7" w:tplc="04190003" w:tentative="1">
+      <w:start w:val="1"/>
+      <w:numFmt w:val="bullet"/>
+      <w:lvlText w:val="o"/>
+      <w:lvlJc w:val="left"/>
+      <w:pPr>
+        <w:ind w:left="5760" w:hanging="360"/>
+      </w:pPr>
+      <w:rPr>
+        <w:rFonts w:ascii="Courier New" w:hAnsi="Courier New" w:cs="Courier New" w:hint="default"/>
+      </w:rPr>
+    </w:lvl>
+    <w:lvl w:ilvl="8" w:tplc="04190005" w:tentative="1">
+      <w:start w:val="1"/>
+      <w:numFmt w:val="bullet"/>
+      <w:lvlText w:val=""/>
+      <w:lvlJc w:val="left"/>
+      <w:pPr>
+        <w:ind w:left="6480" w:hanging="360"/>
+      </w:pPr>
+      <w:rPr>
+        <w:rFonts w:ascii="Wingdings" w:hAnsi="Wingdings" w:hint="default"/>
+      </w:rPr>
+    </w:lvl>
+  </w:abstractNum>
+  <w:abstractNum w:abstractNumId="1" w15:restartNumberingAfterBreak="0">
     <w:nsid w:val="0AE51D2F"/>
     <w:multiLevelType w:val="hybridMultilevel"/>
     <w:tmpl w:val="800CD2A8"/>
@@ -9774,7 +10078,7 @@
       </w:rPr>
     </w:lvl>
   </w:abstractNum>
-  <w:abstractNum w:abstractNumId="1" w15:restartNumberingAfterBreak="0">
+  <w:abstractNum w:abstractNumId="2" w15:restartNumberingAfterBreak="0">
     <w:nsid w:val="0E103590"/>
     <w:multiLevelType w:val="hybridMultilevel"/>
     <w:tmpl w:val="3DE283C8"/>
@@ -9887,7 +10191,7 @@
       </w:rPr>
     </w:lvl>
   </w:abstractNum>
-  <w:abstractNum w:abstractNumId="2" w15:restartNumberingAfterBreak="0">
+  <w:abstractNum w:abstractNumId="3" w15:restartNumberingAfterBreak="0">
     <w:nsid w:val="11C72F8E"/>
     <w:multiLevelType w:val="hybridMultilevel"/>
     <w:tmpl w:val="165069F0"/>
@@ -10000,7 +10304,7 @@
       </w:rPr>
     </w:lvl>
   </w:abstractNum>
-  <w:abstractNum w:abstractNumId="3" w15:restartNumberingAfterBreak="0">
+  <w:abstractNum w:abstractNumId="4" w15:restartNumberingAfterBreak="0">
     <w:nsid w:val="17443E81"/>
     <w:multiLevelType w:val="hybridMultilevel"/>
     <w:tmpl w:val="4BF42458"/>
@@ -10113,7 +10417,7 @@
       </w:rPr>
     </w:lvl>
   </w:abstractNum>
-  <w:abstractNum w:abstractNumId="4" w15:restartNumberingAfterBreak="0">
+  <w:abstractNum w:abstractNumId="5" w15:restartNumberingAfterBreak="0">
     <w:nsid w:val="19796DC2"/>
     <w:multiLevelType w:val="hybridMultilevel"/>
     <w:tmpl w:val="045CB9EE"/>
@@ -10202,7 +10506,7 @@
       </w:pPr>
     </w:lvl>
   </w:abstractNum>
-  <w:abstractNum w:abstractNumId="5" w15:restartNumberingAfterBreak="0">
+  <w:abstractNum w:abstractNumId="6" w15:restartNumberingAfterBreak="0">
     <w:nsid w:val="1EAC524E"/>
     <w:multiLevelType w:val="hybridMultilevel"/>
     <w:tmpl w:val="8946DBB6"/>
@@ -10315,7 +10619,7 @@
       </w:rPr>
     </w:lvl>
   </w:abstractNum>
-  <w:abstractNum w:abstractNumId="6" w15:restartNumberingAfterBreak="0">
+  <w:abstractNum w:abstractNumId="7" w15:restartNumberingAfterBreak="0">
     <w:nsid w:val="205C1E24"/>
     <w:multiLevelType w:val="hybridMultilevel"/>
     <w:tmpl w:val="E5CC6E0C"/>
@@ -10428,7 +10732,7 @@
       </w:rPr>
     </w:lvl>
   </w:abstractNum>
-  <w:abstractNum w:abstractNumId="7" w15:restartNumberingAfterBreak="0">
+  <w:abstractNum w:abstractNumId="8" w15:restartNumberingAfterBreak="0">
     <w:nsid w:val="2A331249"/>
     <w:multiLevelType w:val="hybridMultilevel"/>
     <w:tmpl w:val="045CB9EE"/>
@@ -10517,7 +10821,7 @@
       </w:pPr>
     </w:lvl>
   </w:abstractNum>
-  <w:abstractNum w:abstractNumId="8" w15:restartNumberingAfterBreak="0">
+  <w:abstractNum w:abstractNumId="9" w15:restartNumberingAfterBreak="0">
     <w:nsid w:val="2F4770C7"/>
     <w:multiLevelType w:val="hybridMultilevel"/>
     <w:tmpl w:val="E5D0EA08"/>
@@ -10606,7 +10910,7 @@
       </w:pPr>
     </w:lvl>
   </w:abstractNum>
-  <w:abstractNum w:abstractNumId="9" w15:restartNumberingAfterBreak="0">
+  <w:abstractNum w:abstractNumId="10" w15:restartNumberingAfterBreak="0">
     <w:nsid w:val="2FFC11AA"/>
     <w:multiLevelType w:val="hybridMultilevel"/>
     <w:tmpl w:val="045CB9EE"/>
@@ -10695,7 +10999,7 @@
       </w:pPr>
     </w:lvl>
   </w:abstractNum>
-  <w:abstractNum w:abstractNumId="10" w15:restartNumberingAfterBreak="0">
+  <w:abstractNum w:abstractNumId="11" w15:restartNumberingAfterBreak="0">
     <w:nsid w:val="325B10D1"/>
     <w:multiLevelType w:val="hybridMultilevel"/>
     <w:tmpl w:val="8CC611D2"/>
@@ -10808,7 +11112,7 @@
       </w:rPr>
     </w:lvl>
   </w:abstractNum>
-  <w:abstractNum w:abstractNumId="11" w15:restartNumberingAfterBreak="0">
+  <w:abstractNum w:abstractNumId="12" w15:restartNumberingAfterBreak="0">
     <w:nsid w:val="40B341D5"/>
     <w:multiLevelType w:val="hybridMultilevel"/>
     <w:tmpl w:val="468CDD4A"/>
@@ -10897,7 +11201,7 @@
       </w:pPr>
     </w:lvl>
   </w:abstractNum>
-  <w:abstractNum w:abstractNumId="12" w15:restartNumberingAfterBreak="0">
+  <w:abstractNum w:abstractNumId="13" w15:restartNumberingAfterBreak="0">
     <w:nsid w:val="46270EE1"/>
     <w:multiLevelType w:val="hybridMultilevel"/>
     <w:tmpl w:val="DCF06B9A"/>
@@ -11010,7 +11314,7 @@
       </w:rPr>
     </w:lvl>
   </w:abstractNum>
-  <w:abstractNum w:abstractNumId="13" w15:restartNumberingAfterBreak="0">
+  <w:abstractNum w:abstractNumId="14" w15:restartNumberingAfterBreak="0">
     <w:nsid w:val="4D3C45CA"/>
     <w:multiLevelType w:val="hybridMultilevel"/>
     <w:tmpl w:val="1EC6FE26"/>
@@ -11099,7 +11403,7 @@
       </w:pPr>
     </w:lvl>
   </w:abstractNum>
-  <w:abstractNum w:abstractNumId="14" w15:restartNumberingAfterBreak="0">
+  <w:abstractNum w:abstractNumId="15" w15:restartNumberingAfterBreak="0">
     <w:nsid w:val="52623800"/>
     <w:multiLevelType w:val="hybridMultilevel"/>
     <w:tmpl w:val="32C40106"/>
@@ -11212,7 +11516,7 @@
       </w:rPr>
     </w:lvl>
   </w:abstractNum>
-  <w:abstractNum w:abstractNumId="15" w15:restartNumberingAfterBreak="0">
+  <w:abstractNum w:abstractNumId="16" w15:restartNumberingAfterBreak="0">
     <w:nsid w:val="547855C6"/>
     <w:multiLevelType w:val="hybridMultilevel"/>
     <w:tmpl w:val="9948D456"/>
@@ -11325,7 +11629,7 @@
       </w:rPr>
     </w:lvl>
   </w:abstractNum>
-  <w:abstractNum w:abstractNumId="16" w15:restartNumberingAfterBreak="0">
+  <w:abstractNum w:abstractNumId="17" w15:restartNumberingAfterBreak="0">
     <w:nsid w:val="57854CA7"/>
     <w:multiLevelType w:val="hybridMultilevel"/>
     <w:tmpl w:val="E010680A"/>
@@ -11411,7 +11715,7 @@
       </w:pPr>
     </w:lvl>
   </w:abstractNum>
-  <w:abstractNum w:abstractNumId="17" w15:restartNumberingAfterBreak="0">
+  <w:abstractNum w:abstractNumId="18" w15:restartNumberingAfterBreak="0">
     <w:nsid w:val="57FC1630"/>
     <w:multiLevelType w:val="hybridMultilevel"/>
     <w:tmpl w:val="BC0A3F0E"/>
@@ -11524,7 +11828,7 @@
       </w:rPr>
     </w:lvl>
   </w:abstractNum>
-  <w:abstractNum w:abstractNumId="18" w15:restartNumberingAfterBreak="0">
+  <w:abstractNum w:abstractNumId="19" w15:restartNumberingAfterBreak="0">
     <w:nsid w:val="59457B08"/>
     <w:multiLevelType w:val="hybridMultilevel"/>
     <w:tmpl w:val="6CFA3938"/>
@@ -11637,7 +11941,7 @@
       </w:rPr>
     </w:lvl>
   </w:abstractNum>
-  <w:abstractNum w:abstractNumId="19" w15:restartNumberingAfterBreak="0">
+  <w:abstractNum w:abstractNumId="20" w15:restartNumberingAfterBreak="0">
     <w:nsid w:val="5EA657DA"/>
     <w:multiLevelType w:val="hybridMultilevel"/>
     <w:tmpl w:val="10888D9A"/>
@@ -11750,7 +12054,7 @@
       </w:rPr>
     </w:lvl>
   </w:abstractNum>
-  <w:abstractNum w:abstractNumId="20" w15:restartNumberingAfterBreak="0">
+  <w:abstractNum w:abstractNumId="21" w15:restartNumberingAfterBreak="0">
     <w:nsid w:val="633D68F1"/>
     <w:multiLevelType w:val="hybridMultilevel"/>
     <w:tmpl w:val="79066ABE"/>
@@ -11863,7 +12167,7 @@
       </w:rPr>
     </w:lvl>
   </w:abstractNum>
-  <w:abstractNum w:abstractNumId="21" w15:restartNumberingAfterBreak="0">
+  <w:abstractNum w:abstractNumId="22" w15:restartNumberingAfterBreak="0">
     <w:nsid w:val="7B780120"/>
     <w:multiLevelType w:val="hybridMultilevel"/>
     <w:tmpl w:val="CC44E8FE"/>
@@ -11953,70 +12257,73 @@
     </w:lvl>
   </w:abstractNum>
   <w:num w:numId="1">
+    <w:abstractNumId w:val="19"/>
+  </w:num>
+  <w:num w:numId="2">
+    <w:abstractNumId w:val="17"/>
+  </w:num>
+  <w:num w:numId="3">
+    <w:abstractNumId w:val="20"/>
+  </w:num>
+  <w:num w:numId="4">
+    <w:abstractNumId w:val="11"/>
+  </w:num>
+  <w:num w:numId="5">
+    <w:abstractNumId w:val="3"/>
+  </w:num>
+  <w:num w:numId="6">
+    <w:abstractNumId w:val="13"/>
+  </w:num>
+  <w:num w:numId="7">
+    <w:abstractNumId w:val="5"/>
+  </w:num>
+  <w:num w:numId="8">
+    <w:abstractNumId w:val="10"/>
+  </w:num>
+  <w:num w:numId="9">
+    <w:abstractNumId w:val="15"/>
+  </w:num>
+  <w:num w:numId="10">
+    <w:abstractNumId w:val="8"/>
+  </w:num>
+  <w:num w:numId="11">
+    <w:abstractNumId w:val="7"/>
+  </w:num>
+  <w:num w:numId="12">
+    <w:abstractNumId w:val="9"/>
+  </w:num>
+  <w:num w:numId="13">
+    <w:abstractNumId w:val="14"/>
+  </w:num>
+  <w:num w:numId="14">
+    <w:abstractNumId w:val="12"/>
+  </w:num>
+  <w:num w:numId="15">
+    <w:abstractNumId w:val="2"/>
+  </w:num>
+  <w:num w:numId="16">
+    <w:abstractNumId w:val="1"/>
+  </w:num>
+  <w:num w:numId="17">
+    <w:abstractNumId w:val="16"/>
+  </w:num>
+  <w:num w:numId="18">
+    <w:abstractNumId w:val="6"/>
+  </w:num>
+  <w:num w:numId="19">
+    <w:abstractNumId w:val="4"/>
+  </w:num>
+  <w:num w:numId="20">
+    <w:abstractNumId w:val="21"/>
+  </w:num>
+  <w:num w:numId="21">
+    <w:abstractNumId w:val="22"/>
+  </w:num>
+  <w:num w:numId="22">
     <w:abstractNumId w:val="18"/>
   </w:num>
-  <w:num w:numId="2">
-    <w:abstractNumId w:val="16"/>
-  </w:num>
-  <w:num w:numId="3">
-    <w:abstractNumId w:val="19"/>
-  </w:num>
-  <w:num w:numId="4">
-    <w:abstractNumId w:val="10"/>
-  </w:num>
-  <w:num w:numId="5">
-    <w:abstractNumId w:val="2"/>
-  </w:num>
-  <w:num w:numId="6">
-    <w:abstractNumId w:val="12"/>
-  </w:num>
-  <w:num w:numId="7">
-    <w:abstractNumId w:val="4"/>
-  </w:num>
-  <w:num w:numId="8">
-    <w:abstractNumId w:val="9"/>
-  </w:num>
-  <w:num w:numId="9">
-    <w:abstractNumId w:val="14"/>
-  </w:num>
-  <w:num w:numId="10">
-    <w:abstractNumId w:val="7"/>
-  </w:num>
-  <w:num w:numId="11">
-    <w:abstractNumId w:val="6"/>
-  </w:num>
-  <w:num w:numId="12">
-    <w:abstractNumId w:val="8"/>
-  </w:num>
-  <w:num w:numId="13">
-    <w:abstractNumId w:val="13"/>
-  </w:num>
-  <w:num w:numId="14">
-    <w:abstractNumId w:val="11"/>
-  </w:num>
-  <w:num w:numId="15">
-    <w:abstractNumId w:val="1"/>
-  </w:num>
-  <w:num w:numId="16">
+  <w:num w:numId="23">
     <w:abstractNumId w:val="0"/>
-  </w:num>
-  <w:num w:numId="17">
-    <w:abstractNumId w:val="15"/>
-  </w:num>
-  <w:num w:numId="18">
-    <w:abstractNumId w:val="5"/>
-  </w:num>
-  <w:num w:numId="19">
-    <w:abstractNumId w:val="3"/>
-  </w:num>
-  <w:num w:numId="20">
-    <w:abstractNumId w:val="20"/>
-  </w:num>
-  <w:num w:numId="21">
-    <w:abstractNumId w:val="21"/>
-  </w:num>
-  <w:num w:numId="22">
-    <w:abstractNumId w:val="17"/>
   </w:num>
 </w:numbering>
 </file>
@@ -12695,6 +13002,18 @@
       <w:contextualSpacing/>
     </w:pPr>
   </w:style>
+  <w:style w:type="character" w:styleId="ab">
+    <w:name w:val="FollowedHyperlink"/>
+    <w:basedOn w:val="a0"/>
+    <w:uiPriority w:val="99"/>
+    <w:semiHidden/>
+    <w:unhideWhenUsed/>
+    <w:rsid w:val="004B1AC8"/>
+    <w:rPr>
+      <w:color w:val="954F72" w:themeColor="followedHyperlink"/>
+      <w:u w:val="single"/>
+    </w:rPr>
+  </w:style>
 </w:styles>
 </file>
 
@@ -12964,7 +13283,7 @@
 </file>
 
 <file path=customXml/itemProps1.xml><?xml version="1.0" encoding="utf-8"?>
-<ds:datastoreItem xmlns:ds="http://schemas.openxmlformats.org/officeDocument/2006/customXml" ds:itemID="{3F8BEB3B-B7E3-4F44-801F-DFCEB8FA972C}">
+<ds:datastoreItem xmlns:ds="http://schemas.openxmlformats.org/officeDocument/2006/customXml" ds:itemID="{FF6C8593-C44D-4801-9893-EEC67F80E5D4}">
   <ds:schemaRefs>
     <ds:schemaRef ds:uri="http://schemas.openxmlformats.org/officeDocument/2006/bibliography"/>
   </ds:schemaRefs>

</xml_diff>